<commit_message>
Added new charts and categories, comments and cleaned the code
</commit_message>
<xml_diff>
--- a/Shiny_Merv_Markdown_Template.docx
+++ b/Shiny_Merv_Markdown_Template.docx
@@ -2,11 +2,25 @@
 <file path=word/document.xml><?xml version="1.0" encoding="utf-8"?>
 <w:document xmlns:wpc="http://schemas.microsoft.com/office/word/2010/wordprocessingCanvas" xmlns:cx="http://schemas.microsoft.com/office/drawing/2014/chartex" xmlns:cx1="http://schemas.microsoft.com/office/drawing/2015/9/8/chartex" xmlns:cx2="http://schemas.microsoft.com/office/drawing/2015/10/21/chartex" xmlns:cx3="http://schemas.microsoft.com/office/drawing/2016/5/9/chartex" xmlns:cx4="http://schemas.microsoft.com/office/drawing/2016/5/10/chartex" xmlns:cx5="http://schemas.microsoft.com/office/drawing/2016/5/11/chartex" xmlns:cx6="http://schemas.microsoft.com/office/drawing/2016/5/12/chartex" xmlns:cx7="http://schemas.microsoft.com/office/drawing/2016/5/13/chartex" xmlns:cx8="http://schemas.microsoft.com/office/drawing/2016/5/14/chartex" xmlns:mc="http://schemas.openxmlformats.org/markup-compatibility/2006" xmlns:aink="http://schemas.microsoft.com/office/drawing/2016/ink" xmlns:am3d="http://schemas.microsoft.com/office/drawing/2017/model3d" xmlns:o="urn:schemas-microsoft-com:office:office" xmlns:r="http://schemas.openxmlformats.org/officeDocument/2006/relationships" xmlns:m="http://schemas.openxmlformats.org/officeDocument/2006/math" xmlns:v="urn:schemas-microsoft-com:vml" xmlns:wp14="http://schemas.microsoft.com/office/word/2010/wordprocessingDrawing" xmlns:wp="http://schemas.openxmlformats.org/drawingml/2006/wordprocessingDrawing" xmlns:w10="urn:schemas-microsoft-com:office:word" xmlns:w="http://schemas.openxmlformats.org/wordprocessingml/2006/main" xmlns:w14="http://schemas.microsoft.com/office/word/2010/wordml" xmlns:w15="http://schemas.microsoft.com/office/word/2012/wordml" xmlns:w16cex="http://schemas.microsoft.com/office/word/2018/wordml/cex" xmlns:w16cid="http://schemas.microsoft.com/office/word/2016/wordml/cid" xmlns:w16="http://schemas.microsoft.com/office/word/2018/wordml" xmlns:w16sdtdh="http://schemas.microsoft.com/office/word/2020/wordml/sdtdatahash" xmlns:w16se="http://schemas.microsoft.com/office/word/2015/wordml/symex" xmlns:wpg="http://schemas.microsoft.com/office/word/2010/wordprocessingGroup" xmlns:wpi="http://schemas.microsoft.com/office/word/2010/wordprocessingInk" xmlns:wne="http://schemas.microsoft.com/office/word/2006/wordml" xmlns:wps="http://schemas.microsoft.com/office/word/2010/wordprocessingShape" mc:Ignorable="w14 w15 w16se w16cid w16 w16cex w16sdtdh wp14">
   <w:body>
-    <w:p/>
+    <w:p>
+      <w:pPr>
+        <w:pStyle w:val="Compact"/>
+        <w:spacing w:before="0" w:after="0"/>
+        <w:contextualSpacing/>
+        <w:rPr>
+          <w:lang w:val="de-CH"/>
+        </w:rPr>
+      </w:pPr>
+    </w:p>
     <w:sectPr>
-      <w:pgSz w:w="12240" w:h="15840"/>
-      <w:pgMar w:top="1440" w:right="1440" w:bottom="1440" w:left="1440" w:header="720" w:footer="720" w:gutter="0"/>
+      <w:footerReference w:type="default" r:id="rId8"/>
+      <w:headerReference w:type="first" r:id="rId9"/>
+      <w:footerReference w:type="first" r:id="rId10"/>
+      <w:pgSz w:w="11906" w:h="16838" w:code="9"/>
+      <w:pgMar w:top="1440" w:right="1440" w:bottom="1440" w:left="1440" w:header="426" w:footer="720" w:gutter="0"/>
       <w:cols w:space="720"/>
+      <w:titlePg/>
+      <w:docGrid w:linePitch="272"/>
     </w:sectPr>
   </w:body>
 </w:document>
@@ -31,6 +45,112 @@
 </w:endnotes>
 </file>
 
+<file path=word/footer1.xml><?xml version="1.0" encoding="utf-8"?>
+<w:ftr xmlns:wpc="http://schemas.microsoft.com/office/word/2010/wordprocessingCanvas" xmlns:cx="http://schemas.microsoft.com/office/drawing/2014/chartex" xmlns:cx1="http://schemas.microsoft.com/office/drawing/2015/9/8/chartex" xmlns:cx2="http://schemas.microsoft.com/office/drawing/2015/10/21/chartex" xmlns:cx3="http://schemas.microsoft.com/office/drawing/2016/5/9/chartex" xmlns:cx4="http://schemas.microsoft.com/office/drawing/2016/5/10/chartex" xmlns:cx5="http://schemas.microsoft.com/office/drawing/2016/5/11/chartex" xmlns:cx6="http://schemas.microsoft.com/office/drawing/2016/5/12/chartex" xmlns:cx7="http://schemas.microsoft.com/office/drawing/2016/5/13/chartex" xmlns:cx8="http://schemas.microsoft.com/office/drawing/2016/5/14/chartex" xmlns:mc="http://schemas.openxmlformats.org/markup-compatibility/2006" xmlns:aink="http://schemas.microsoft.com/office/drawing/2016/ink" xmlns:am3d="http://schemas.microsoft.com/office/drawing/2017/model3d" xmlns:o="urn:schemas-microsoft-com:office:office" xmlns:r="http://schemas.openxmlformats.org/officeDocument/2006/relationships" xmlns:m="http://schemas.openxmlformats.org/officeDocument/2006/math" xmlns:v="urn:schemas-microsoft-com:vml" xmlns:wp14="http://schemas.microsoft.com/office/word/2010/wordprocessingDrawing" xmlns:wp="http://schemas.openxmlformats.org/drawingml/2006/wordprocessingDrawing" xmlns:w10="urn:schemas-microsoft-com:office:word" xmlns:w="http://schemas.openxmlformats.org/wordprocessingml/2006/main" xmlns:w14="http://schemas.microsoft.com/office/word/2010/wordml" xmlns:w15="http://schemas.microsoft.com/office/word/2012/wordml" xmlns:w16cex="http://schemas.microsoft.com/office/word/2018/wordml/cex" xmlns:w16cid="http://schemas.microsoft.com/office/word/2016/wordml/cid" xmlns:w16="http://schemas.microsoft.com/office/word/2018/wordml" xmlns:w16sdtdh="http://schemas.microsoft.com/office/word/2020/wordml/sdtdatahash" xmlns:w16se="http://schemas.microsoft.com/office/word/2015/wordml/symex" xmlns:wpg="http://schemas.microsoft.com/office/word/2010/wordprocessingGroup" xmlns:wpi="http://schemas.microsoft.com/office/word/2010/wordprocessingInk" xmlns:wne="http://schemas.microsoft.com/office/word/2006/wordml" xmlns:wps="http://schemas.microsoft.com/office/word/2010/wordprocessingShape" mc:Ignorable="w14 w15 w16se w16cid w16 w16cex w16sdtdh wp14">
+  <w:sdt>
+    <w:sdtPr>
+      <w:id w:val="330958890"/>
+      <w:docPartObj>
+        <w:docPartGallery w:val="Page Numbers (Bottom of Page)"/>
+        <w:docPartUnique/>
+      </w:docPartObj>
+    </w:sdtPr>
+    <w:sdtEndPr>
+      <w:rPr>
+        <w:noProof/>
+      </w:rPr>
+    </w:sdtEndPr>
+    <w:sdtContent>
+      <w:p>
+        <w:pPr>
+          <w:pStyle w:val="Footer"/>
+          <w:jc w:val="right"/>
+        </w:pPr>
+        <w:r>
+          <w:fldChar w:fldCharType="begin"/>
+        </w:r>
+        <w:r>
+          <w:instrText xml:space="preserve"> PAGE   \* MERGEFORMAT </w:instrText>
+        </w:r>
+        <w:r>
+          <w:fldChar w:fldCharType="separate"/>
+        </w:r>
+        <w:r>
+          <w:rPr>
+            <w:noProof/>
+          </w:rPr>
+          <w:t>2</w:t>
+        </w:r>
+        <w:r>
+          <w:rPr>
+            <w:noProof/>
+          </w:rPr>
+          <w:fldChar w:fldCharType="end"/>
+        </w:r>
+      </w:p>
+    </w:sdtContent>
+  </w:sdt>
+  <w:p>
+    <w:pPr>
+      <w:pStyle w:val="Footer"/>
+    </w:pPr>
+  </w:p>
+</w:ftr>
+</file>
+
+<file path=word/footer2.xml><?xml version="1.0" encoding="utf-8"?>
+<w:ftr xmlns:wpc="http://schemas.microsoft.com/office/word/2010/wordprocessingCanvas" xmlns:cx="http://schemas.microsoft.com/office/drawing/2014/chartex" xmlns:cx1="http://schemas.microsoft.com/office/drawing/2015/9/8/chartex" xmlns:cx2="http://schemas.microsoft.com/office/drawing/2015/10/21/chartex" xmlns:cx3="http://schemas.microsoft.com/office/drawing/2016/5/9/chartex" xmlns:cx4="http://schemas.microsoft.com/office/drawing/2016/5/10/chartex" xmlns:cx5="http://schemas.microsoft.com/office/drawing/2016/5/11/chartex" xmlns:cx6="http://schemas.microsoft.com/office/drawing/2016/5/12/chartex" xmlns:cx7="http://schemas.microsoft.com/office/drawing/2016/5/13/chartex" xmlns:cx8="http://schemas.microsoft.com/office/drawing/2016/5/14/chartex" xmlns:mc="http://schemas.openxmlformats.org/markup-compatibility/2006" xmlns:aink="http://schemas.microsoft.com/office/drawing/2016/ink" xmlns:am3d="http://schemas.microsoft.com/office/drawing/2017/model3d" xmlns:o="urn:schemas-microsoft-com:office:office" xmlns:r="http://schemas.openxmlformats.org/officeDocument/2006/relationships" xmlns:m="http://schemas.openxmlformats.org/officeDocument/2006/math" xmlns:v="urn:schemas-microsoft-com:vml" xmlns:wp14="http://schemas.microsoft.com/office/word/2010/wordprocessingDrawing" xmlns:wp="http://schemas.openxmlformats.org/drawingml/2006/wordprocessingDrawing" xmlns:w10="urn:schemas-microsoft-com:office:word" xmlns:w="http://schemas.openxmlformats.org/wordprocessingml/2006/main" xmlns:w14="http://schemas.microsoft.com/office/word/2010/wordml" xmlns:w15="http://schemas.microsoft.com/office/word/2012/wordml" xmlns:w16cex="http://schemas.microsoft.com/office/word/2018/wordml/cex" xmlns:w16cid="http://schemas.microsoft.com/office/word/2016/wordml/cid" xmlns:w16="http://schemas.microsoft.com/office/word/2018/wordml" xmlns:w16sdtdh="http://schemas.microsoft.com/office/word/2020/wordml/sdtdatahash" xmlns:w16se="http://schemas.microsoft.com/office/word/2015/wordml/symex" xmlns:wpg="http://schemas.microsoft.com/office/word/2010/wordprocessingGroup" xmlns:wpi="http://schemas.microsoft.com/office/word/2010/wordprocessingInk" xmlns:wne="http://schemas.microsoft.com/office/word/2006/wordml" xmlns:wps="http://schemas.microsoft.com/office/word/2010/wordprocessingShape" mc:Ignorable="w14 w15 w16se w16cid w16 w16cex w16sdtdh wp14">
+  <w:sdt>
+    <w:sdtPr>
+      <w:id w:val="-1812863037"/>
+      <w:docPartObj>
+        <w:docPartGallery w:val="Page Numbers (Bottom of Page)"/>
+        <w:docPartUnique/>
+      </w:docPartObj>
+    </w:sdtPr>
+    <w:sdtEndPr>
+      <w:rPr>
+        <w:noProof/>
+      </w:rPr>
+    </w:sdtEndPr>
+    <w:sdtContent>
+      <w:p>
+        <w:pPr>
+          <w:pStyle w:val="Footer"/>
+          <w:jc w:val="right"/>
+        </w:pPr>
+        <w:r>
+          <w:fldChar w:fldCharType="begin"/>
+        </w:r>
+        <w:r>
+          <w:instrText xml:space="preserve"> PAGE   \* MERGEFORMAT </w:instrText>
+        </w:r>
+        <w:r>
+          <w:fldChar w:fldCharType="separate"/>
+        </w:r>
+        <w:r>
+          <w:rPr>
+            <w:noProof/>
+          </w:rPr>
+          <w:t>2</w:t>
+        </w:r>
+        <w:r>
+          <w:rPr>
+            <w:noProof/>
+          </w:rPr>
+          <w:fldChar w:fldCharType="end"/>
+        </w:r>
+      </w:p>
+    </w:sdtContent>
+  </w:sdt>
+  <w:p>
+    <w:pPr>
+      <w:pStyle w:val="Footer"/>
+    </w:pPr>
+  </w:p>
+</w:ftr>
+</file>
+
 <file path=word/footnotes.xml><?xml version="1.0" encoding="utf-8"?>
 <w:footnotes xmlns:wpc="http://schemas.microsoft.com/office/word/2010/wordprocessingCanvas" xmlns:cx="http://schemas.microsoft.com/office/drawing/2014/chartex" xmlns:cx1="http://schemas.microsoft.com/office/drawing/2015/9/8/chartex" xmlns:cx2="http://schemas.microsoft.com/office/drawing/2015/10/21/chartex" xmlns:cx3="http://schemas.microsoft.com/office/drawing/2016/5/9/chartex" xmlns:cx4="http://schemas.microsoft.com/office/drawing/2016/5/10/chartex" xmlns:cx5="http://schemas.microsoft.com/office/drawing/2016/5/11/chartex" xmlns:cx6="http://schemas.microsoft.com/office/drawing/2016/5/12/chartex" xmlns:cx7="http://schemas.microsoft.com/office/drawing/2016/5/13/chartex" xmlns:cx8="http://schemas.microsoft.com/office/drawing/2016/5/14/chartex" xmlns:mc="http://schemas.openxmlformats.org/markup-compatibility/2006" xmlns:aink="http://schemas.microsoft.com/office/drawing/2016/ink" xmlns:am3d="http://schemas.microsoft.com/office/drawing/2017/model3d" xmlns:o="urn:schemas-microsoft-com:office:office" xmlns:r="http://schemas.openxmlformats.org/officeDocument/2006/relationships" xmlns:m="http://schemas.openxmlformats.org/officeDocument/2006/math" xmlns:v="urn:schemas-microsoft-com:vml" xmlns:wp14="http://schemas.microsoft.com/office/word/2010/wordprocessingDrawing" xmlns:wp="http://schemas.openxmlformats.org/drawingml/2006/wordprocessingDrawing" xmlns:w10="urn:schemas-microsoft-com:office:word" xmlns:w="http://schemas.openxmlformats.org/wordprocessingml/2006/main" xmlns:w14="http://schemas.microsoft.com/office/word/2010/wordml" xmlns:w15="http://schemas.microsoft.com/office/word/2012/wordml" xmlns:w16cex="http://schemas.microsoft.com/office/word/2018/wordml/cex" xmlns:w16cid="http://schemas.microsoft.com/office/word/2016/wordml/cid" xmlns:w16="http://schemas.microsoft.com/office/word/2018/wordml" xmlns:w16sdtdh="http://schemas.microsoft.com/office/word/2020/wordml/sdtdatahash" xmlns:w16se="http://schemas.microsoft.com/office/word/2015/wordml/symex" xmlns:wpg="http://schemas.microsoft.com/office/word/2010/wordprocessingGroup" xmlns:wpi="http://schemas.microsoft.com/office/word/2010/wordprocessingInk" xmlns:wne="http://schemas.microsoft.com/office/word/2006/wordml" xmlns:wps="http://schemas.microsoft.com/office/word/2010/wordprocessingShape" mc:Ignorable="w14 w15 w16se w16cid w16 w16cex w16sdtdh wp14">
   <w:footnote w:type="separator" w:id="-1">
@@ -48,6 +168,124 @@
     </w:p>
   </w:footnote>
 </w:footnotes>
+</file>
+
+<file path=word/header1.xml><?xml version="1.0" encoding="utf-8"?>
+<w:hdr xmlns:wpc="http://schemas.microsoft.com/office/word/2010/wordprocessingCanvas" xmlns:cx="http://schemas.microsoft.com/office/drawing/2014/chartex" xmlns:cx1="http://schemas.microsoft.com/office/drawing/2015/9/8/chartex" xmlns:cx2="http://schemas.microsoft.com/office/drawing/2015/10/21/chartex" xmlns:cx3="http://schemas.microsoft.com/office/drawing/2016/5/9/chartex" xmlns:cx4="http://schemas.microsoft.com/office/drawing/2016/5/10/chartex" xmlns:cx5="http://schemas.microsoft.com/office/drawing/2016/5/11/chartex" xmlns:cx6="http://schemas.microsoft.com/office/drawing/2016/5/12/chartex" xmlns:cx7="http://schemas.microsoft.com/office/drawing/2016/5/13/chartex" xmlns:cx8="http://schemas.microsoft.com/office/drawing/2016/5/14/chartex" xmlns:mc="http://schemas.openxmlformats.org/markup-compatibility/2006" xmlns:aink="http://schemas.microsoft.com/office/drawing/2016/ink" xmlns:am3d="http://schemas.microsoft.com/office/drawing/2017/model3d" xmlns:o="urn:schemas-microsoft-com:office:office" xmlns:r="http://schemas.openxmlformats.org/officeDocument/2006/relationships" xmlns:m="http://schemas.openxmlformats.org/officeDocument/2006/math" xmlns:v="urn:schemas-microsoft-com:vml" xmlns:wp14="http://schemas.microsoft.com/office/word/2010/wordprocessingDrawing" xmlns:wp="http://schemas.openxmlformats.org/drawingml/2006/wordprocessingDrawing" xmlns:w10="urn:schemas-microsoft-com:office:word" xmlns:w="http://schemas.openxmlformats.org/wordprocessingml/2006/main" xmlns:w14="http://schemas.microsoft.com/office/word/2010/wordml" xmlns:w15="http://schemas.microsoft.com/office/word/2012/wordml" xmlns:w16cex="http://schemas.microsoft.com/office/word/2018/wordml/cex" xmlns:w16cid="http://schemas.microsoft.com/office/word/2016/wordml/cid" xmlns:w16="http://schemas.microsoft.com/office/word/2018/wordml" xmlns:w16sdtdh="http://schemas.microsoft.com/office/word/2020/wordml/sdtdatahash" xmlns:w16se="http://schemas.microsoft.com/office/word/2015/wordml/symex" xmlns:wpg="http://schemas.microsoft.com/office/word/2010/wordprocessingGroup" xmlns:wpi="http://schemas.microsoft.com/office/word/2010/wordprocessingInk" xmlns:wne="http://schemas.microsoft.com/office/word/2006/wordml" xmlns:wps="http://schemas.microsoft.com/office/word/2010/wordprocessingShape" mc:Ignorable="w14 w15 w16se w16cid w16 w16cex w16sdtdh wp14">
+  <w:p>
+    <w:pPr>
+      <w:pStyle w:val="Header"/>
+      <w:ind w:left="3969"/>
+      <w:rPr>
+        <w:sz w:val="15"/>
+        <w:szCs w:val="15"/>
+      </w:rPr>
+    </w:pPr>
+    <w:r>
+      <w:rPr>
+        <w:noProof/>
+        <w:sz w:val="15"/>
+        <w:szCs w:val="15"/>
+      </w:rPr>
+      <w:drawing>
+        <wp:anchor distT="0" distB="0" distL="114300" distR="114300" simplePos="0" relativeHeight="251658240" behindDoc="0" locked="0" layoutInCell="1" allowOverlap="1" wp14:anchorId="7067E790" wp14:editId="1E4F8760">
+          <wp:simplePos x="0" y="0"/>
+          <wp:positionH relativeFrom="column">
+            <wp:posOffset>-384810</wp:posOffset>
+          </wp:positionH>
+          <wp:positionV relativeFrom="paragraph">
+            <wp:posOffset>-15240</wp:posOffset>
+          </wp:positionV>
+          <wp:extent cx="1980000" cy="553928"/>
+          <wp:effectExtent l="0" t="0" r="0" b="0"/>
+          <wp:wrapNone/>
+          <wp:docPr id="5" name="Graphic 5"/>
+          <wp:cNvGraphicFramePr>
+            <a:graphicFrameLocks xmlns:a="http://schemas.openxmlformats.org/drawingml/2006/main" noChangeAspect="1"/>
+          </wp:cNvGraphicFramePr>
+          <a:graphic xmlns:a="http://schemas.openxmlformats.org/drawingml/2006/main">
+            <a:graphicData uri="http://schemas.openxmlformats.org/drawingml/2006/picture">
+              <pic:pic xmlns:pic="http://schemas.openxmlformats.org/drawingml/2006/picture">
+                <pic:nvPicPr>
+                  <pic:cNvPr id="1" name="Graphic 1"/>
+                  <pic:cNvPicPr/>
+                </pic:nvPicPr>
+                <pic:blipFill>
+                  <a:blip r:embed="rId1">
+                    <a:extLst>
+                      <a:ext uri="{28A0092B-C50C-407E-A947-70E740481C1C}">
+                        <a14:useLocalDpi xmlns:a14="http://schemas.microsoft.com/office/drawing/2010/main" val="0"/>
+                      </a:ext>
+                      <a:ext uri="{96DAC541-7B7A-43D3-8B79-37D633B846F1}">
+                        <asvg:svgBlip xmlns:asvg="http://schemas.microsoft.com/office/drawing/2016/SVG/main" r:embed="rId2"/>
+                      </a:ext>
+                    </a:extLst>
+                  </a:blip>
+                  <a:stretch>
+                    <a:fillRect/>
+                  </a:stretch>
+                </pic:blipFill>
+                <pic:spPr>
+                  <a:xfrm>
+                    <a:off x="0" y="0"/>
+                    <a:ext cx="1980000" cy="553928"/>
+                  </a:xfrm>
+                  <a:prstGeom prst="rect">
+                    <a:avLst/>
+                  </a:prstGeom>
+                </pic:spPr>
+              </pic:pic>
+            </a:graphicData>
+          </a:graphic>
+          <wp14:sizeRelH relativeFrom="margin">
+            <wp14:pctWidth>0</wp14:pctWidth>
+          </wp14:sizeRelH>
+          <wp14:sizeRelV relativeFrom="margin">
+            <wp14:pctHeight>0</wp14:pctHeight>
+          </wp14:sizeRelV>
+        </wp:anchor>
+      </w:drawing>
+    </w:r>
+    <w:r>
+      <w:rPr>
+        <w:sz w:val="15"/>
+        <w:szCs w:val="15"/>
+      </w:rPr>
+      <w:t>Federal Department of Foreign Affairs FDFA</w:t>
+    </w:r>
+  </w:p>
+  <w:p>
+    <w:pPr>
+      <w:pStyle w:val="Header"/>
+      <w:ind w:left="3969"/>
+      <w:rPr>
+        <w:sz w:val="15"/>
+        <w:szCs w:val="15"/>
+      </w:rPr>
+    </w:pPr>
+  </w:p>
+  <w:p>
+    <w:pPr>
+      <w:pStyle w:val="Header"/>
+      <w:ind w:left="3969"/>
+      <w:rPr>
+        <w:b/>
+        <w:bCs/>
+        <w:sz w:val="15"/>
+        <w:szCs w:val="15"/>
+      </w:rPr>
+    </w:pPr>
+    <w:r>
+      <w:rPr>
+        <w:b/>
+        <w:bCs/>
+        <w:sz w:val="15"/>
+        <w:szCs w:val="15"/>
+      </w:rPr>
+      <w:t>Swiss Agency for Development and Cooperation SDC</w:t>
+    </w:r>
+  </w:p>
+</w:hdr>
 </file>
 
 <file path=word/numbering.xml><?xml version="1.0" encoding="utf-8"?>
@@ -1013,6 +1251,7 @@
     </w:pPrDefault>
   </w:docDefaults>
   <w:latentStyles w:defLockedState="0" w:defUIPriority="0" w:defSemiHidden="0" w:defUnhideWhenUsed="0" w:defQFormat="0" w:count="376">
+    <w:lsdException w:name="footer" w:uiPriority="99"/>
     <w:lsdException w:name="List Bullet" w:qFormat="1"/>
     <w:lsdException w:name="Normal Table" w:semiHidden="1" w:unhideWhenUsed="1"/>
     <w:lsdException w:name="Table Simple 1" w:semiHidden="1" w:unhideWhenUsed="1"/>
@@ -1273,7 +1512,7 @@
     <w:next w:val="BodyText"/>
     <w:uiPriority w:val="9"/>
     <w:qFormat/>
-    <w:rsid w:val="0016217D"/>
+    <w:rsid w:val="00987BBA"/>
     <w:pPr>
       <w:keepNext/>
       <w:keepLines/>
@@ -1285,8 +1524,9 @@
       <w:b/>
       <w:bCs/>
       <w:color w:val="595959" w:themeColor="text1" w:themeTint="A6"/>
-      <w:sz w:val="32"/>
-      <w:szCs w:val="32"/>
+      <w:sz w:val="28"/>
+      <w:szCs w:val="28"/>
+      <w:lang w:val="de-CH"/>
     </w:rPr>
   </w:style>
   <w:style w:type="paragraph" w:styleId="Heading2">
@@ -1296,12 +1536,15 @@
     <w:uiPriority w:val="9"/>
     <w:unhideWhenUsed/>
     <w:qFormat/>
-    <w:rsid w:val="0030797B"/>
+    <w:rsid w:val="0019790A"/>
     <w:pPr>
       <w:keepNext/>
       <w:keepLines/>
+      <w:pBdr>
+        <w:bottom w:val="single" w:sz="4" w:space="1" w:color="auto"/>
+      </w:pBdr>
       <w:shd w:val="clear" w:color="auto" w:fill="F2F2F2" w:themeFill="background1" w:themeFillShade="F2"/>
-      <w:spacing w:before="200" w:after="0" w:line="360" w:lineRule="auto"/>
+      <w:spacing w:before="200" w:after="0" w:line="480" w:lineRule="auto"/>
       <w:outlineLvl w:val="1"/>
     </w:pPr>
     <w:rPr>
@@ -1321,19 +1564,19 @@
     <w:uiPriority w:val="9"/>
     <w:unhideWhenUsed/>
     <w:qFormat/>
-    <w:rsid w:val="00590828"/>
+    <w:rsid w:val="0006659D"/>
     <w:pPr>
       <w:keepNext/>
       <w:keepLines/>
       <w:spacing w:before="200" w:after="0"/>
-      <w:ind w:left="360"/>
       <w:outlineLvl w:val="2"/>
     </w:pPr>
     <w:rPr>
       <w:rFonts w:eastAsiaTheme="majorEastAsia" w:cstheme="majorBidi"/>
-      <w:b/>
-      <w:bCs/>
-      <w:color w:val="404040" w:themeColor="text1" w:themeTint="BF"/>
+      <w:color w:val="595959" w:themeColor="text1" w:themeTint="A6"/>
+      <w:sz w:val="18"/>
+      <w:szCs w:val="18"/>
+      <w:u w:val="single"/>
     </w:rPr>
   </w:style>
   <w:style w:type="paragraph" w:styleId="Heading4">
@@ -1505,12 +1748,11 @@
     <w:basedOn w:val="Normal"/>
     <w:next w:val="BodyText"/>
     <w:qFormat/>
-    <w:rsid w:val="009A3732"/>
+    <w:rsid w:val="00283C52"/>
     <w:pPr>
       <w:keepNext/>
       <w:keepLines/>
       <w:spacing w:before="120" w:after="0"/>
-      <w:jc w:val="center"/>
       <w:outlineLvl w:val="0"/>
     </w:pPr>
     <w:rPr>
@@ -1520,6 +1762,7 @@
       <w:color w:val="262626" w:themeColor="text1" w:themeTint="D9"/>
       <w:sz w:val="32"/>
       <w:szCs w:val="32"/>
+      <w:lang w:val="de-CH"/>
     </w:rPr>
   </w:style>
   <w:style w:type="paragraph" w:styleId="Subtitle">
@@ -1528,14 +1771,10 @@
     <w:next w:val="BodyText"/>
     <w:qFormat/>
     <w:rsid w:val="00F97937"/>
-    <w:pPr>
-      <w:ind w:left="0"/>
-    </w:pPr>
     <w:rPr>
       <w:color w:val="auto"/>
       <w:sz w:val="32"/>
       <w:szCs w:val="32"/>
-      <w:u w:val="single"/>
       <w:lang w:val="de-CH"/>
     </w:rPr>
   </w:style>
@@ -1557,17 +1796,17 @@
     <w:name w:val="Date"/>
     <w:next w:val="BodyText"/>
     <w:qFormat/>
-    <w:rsid w:val="00E6495A"/>
+    <w:rsid w:val="00292929"/>
     <w:pPr>
       <w:keepNext/>
       <w:keepLines/>
-      <w:jc w:val="center"/>
     </w:pPr>
     <w:rPr>
       <w:rFonts w:ascii="Arial" w:hAnsi="Arial"/>
       <w:color w:val="808080" w:themeColor="background1" w:themeShade="80"/>
       <w:sz w:val="20"/>
       <w:szCs w:val="20"/>
+      <w:lang w:val="de-CH"/>
     </w:rPr>
   </w:style>
   <w:style w:type="paragraph" w:customStyle="1" w:styleId="Abstract">
@@ -2108,7 +2347,7 @@
     <w:basedOn w:val="Normal"/>
     <w:link w:val="SubtitlegreenChar"/>
     <w:qFormat/>
-    <w:rsid w:val="00FB09EB"/>
+    <w:rsid w:val="009716D7"/>
     <w:pPr>
       <w:shd w:val="clear" w:color="auto" w:fill="4F6228" w:themeFill="accent3" w:themeFillShade="80"/>
       <w:spacing w:before="240" w:line="480" w:lineRule="auto"/>
@@ -2117,22 +2356,22 @@
       <w:b/>
       <w:bCs/>
       <w:color w:val="FFFFFF" w:themeColor="background1"/>
-      <w:sz w:val="32"/>
-      <w:szCs w:val="32"/>
+      <w:sz w:val="28"/>
+      <w:szCs w:val="28"/>
     </w:rPr>
   </w:style>
   <w:style w:type="character" w:customStyle="1" w:styleId="SubtitlegreenChar">
     <w:name w:val="Subtitle_green Char"/>
     <w:basedOn w:val="DefaultParagraphFont"/>
     <w:link w:val="Subtitlegreen"/>
-    <w:rsid w:val="00FB09EB"/>
+    <w:rsid w:val="009716D7"/>
     <w:rPr>
       <w:rFonts w:ascii="Arial" w:hAnsi="Arial" w:cs="Arial"/>
       <w:b/>
       <w:bCs/>
       <w:color w:val="FFFFFF" w:themeColor="background1"/>
-      <w:sz w:val="32"/>
-      <w:szCs w:val="32"/>
+      <w:sz w:val="28"/>
+      <w:szCs w:val="28"/>
       <w:shd w:val="clear" w:color="auto" w:fill="4F6228" w:themeFill="accent3" w:themeFillShade="80"/>
     </w:rPr>
   </w:style>
@@ -2178,7 +2417,7 @@
     <w:basedOn w:val="Subtitlered"/>
     <w:link w:val="SubtitleblueChar"/>
     <w:qFormat/>
-    <w:rsid w:val="00ED335D"/>
+    <w:rsid w:val="009716D7"/>
     <w:pPr>
       <w:shd w:val="clear" w:color="auto" w:fill="1F497D" w:themeFill="text2"/>
     </w:pPr>
@@ -2220,14 +2459,14 @@
     <w:name w:val="Subtitle_blue Char"/>
     <w:basedOn w:val="SubtitleredChar"/>
     <w:link w:val="Subtitleblue"/>
-    <w:rsid w:val="00ED335D"/>
+    <w:rsid w:val="009716D7"/>
     <w:rPr>
       <w:rFonts w:ascii="Arial" w:hAnsi="Arial" w:cs="Arial"/>
       <w:b/>
       <w:bCs/>
       <w:color w:val="FFFFFF" w:themeColor="background1"/>
-      <w:sz w:val="32"/>
-      <w:szCs w:val="32"/>
+      <w:sz w:val="28"/>
+      <w:szCs w:val="28"/>
       <w:shd w:val="clear" w:color="auto" w:fill="1F497D" w:themeFill="text2"/>
       <w:lang w:val="de-CH"/>
     </w:rPr>
@@ -2237,7 +2476,7 @@
     <w:basedOn w:val="Subtitlegreen"/>
     <w:link w:val="TitlegreyChar"/>
     <w:qFormat/>
-    <w:rsid w:val="00AD6769"/>
+    <w:rsid w:val="009716D7"/>
     <w:pPr>
       <w:pBdr>
         <w:top w:val="single" w:sz="8" w:space="1" w:color="A6A6A6" w:themeColor="background1" w:themeShade="A6"/>
@@ -2256,14 +2495,14 @@
     <w:name w:val="Title_grey Char"/>
     <w:basedOn w:val="SubtitlegreenChar"/>
     <w:link w:val="Titlegrey"/>
-    <w:rsid w:val="00AD6769"/>
+    <w:rsid w:val="009716D7"/>
     <w:rPr>
       <w:rFonts w:ascii="Arial" w:hAnsi="Arial" w:cs="Arial"/>
       <w:b/>
       <w:bCs/>
       <w:color w:val="262626" w:themeColor="text1" w:themeTint="D9"/>
-      <w:sz w:val="32"/>
-      <w:szCs w:val="32"/>
+      <w:sz w:val="28"/>
+      <w:szCs w:val="28"/>
       <w:shd w:val="clear" w:color="auto" w:fill="F2F2F2" w:themeFill="background1" w:themeFillShade="F2"/>
       <w:lang w:val="de-CH"/>
     </w:rPr>
@@ -2293,6 +2532,293 @@
       <w:sz w:val="20"/>
       <w:szCs w:val="20"/>
       <w:lang w:val="de-CH"/>
+    </w:rPr>
+  </w:style>
+  <w:style w:type="paragraph" w:customStyle="1" w:styleId="CaptionNote">
+    <w:name w:val="Caption_Note"/>
+    <w:basedOn w:val="NonBulletInstruction"/>
+    <w:link w:val="CaptionNoteChar"/>
+    <w:qFormat/>
+    <w:rsid w:val="00DC53CA"/>
+    <w:rPr>
+      <w:i w:val="0"/>
+      <w:iCs w:val="0"/>
+      <w:sz w:val="18"/>
+      <w:szCs w:val="18"/>
+    </w:rPr>
+  </w:style>
+  <w:style w:type="character" w:customStyle="1" w:styleId="CaptionNoteChar">
+    <w:name w:val="Caption_Note Char"/>
+    <w:basedOn w:val="NonBulletInstructionChar"/>
+    <w:link w:val="CaptionNote"/>
+    <w:rsid w:val="00DC53CA"/>
+    <w:rPr>
+      <w:rFonts w:ascii="Arial" w:hAnsi="Arial" w:cs="Arial"/>
+      <w:i w:val="0"/>
+      <w:iCs w:val="0"/>
+      <w:color w:val="808080" w:themeColor="background1" w:themeShade="80"/>
+      <w:sz w:val="18"/>
+      <w:szCs w:val="18"/>
+      <w:lang w:val="de-CH"/>
+    </w:rPr>
+  </w:style>
+  <w:style w:type="paragraph" w:styleId="Header">
+    <w:name w:val="header"/>
+    <w:basedOn w:val="Normal"/>
+    <w:link w:val="HeaderChar"/>
+    <w:rsid w:val="00592670"/>
+    <w:pPr>
+      <w:tabs>
+        <w:tab w:val="center" w:pos="4513"/>
+        <w:tab w:val="right" w:pos="9026"/>
+      </w:tabs>
+      <w:spacing w:after="0"/>
+    </w:pPr>
+  </w:style>
+  <w:style w:type="character" w:customStyle="1" w:styleId="HeaderChar">
+    <w:name w:val="Header Char"/>
+    <w:basedOn w:val="DefaultParagraphFont"/>
+    <w:link w:val="Header"/>
+    <w:rsid w:val="00592670"/>
+    <w:rPr>
+      <w:rFonts w:ascii="Arial" w:hAnsi="Arial" w:cs="Arial"/>
+      <w:sz w:val="20"/>
+      <w:szCs w:val="20"/>
+    </w:rPr>
+  </w:style>
+  <w:style w:type="paragraph" w:styleId="Footer">
+    <w:name w:val="footer"/>
+    <w:basedOn w:val="Normal"/>
+    <w:link w:val="FooterChar"/>
+    <w:uiPriority w:val="99"/>
+    <w:rsid w:val="00592670"/>
+    <w:pPr>
+      <w:tabs>
+        <w:tab w:val="center" w:pos="4513"/>
+        <w:tab w:val="right" w:pos="9026"/>
+      </w:tabs>
+      <w:spacing w:after="0"/>
+    </w:pPr>
+  </w:style>
+  <w:style w:type="character" w:customStyle="1" w:styleId="FooterChar">
+    <w:name w:val="Footer Char"/>
+    <w:basedOn w:val="DefaultParagraphFont"/>
+    <w:link w:val="Footer"/>
+    <w:uiPriority w:val="99"/>
+    <w:rsid w:val="00592670"/>
+    <w:rPr>
+      <w:rFonts w:ascii="Arial" w:hAnsi="Arial" w:cs="Arial"/>
+      <w:sz w:val="20"/>
+      <w:szCs w:val="20"/>
+    </w:rPr>
+  </w:style>
+  <w:style w:type="paragraph" w:customStyle="1" w:styleId="Heading2blue">
+    <w:name w:val="Heading 2_blue"/>
+    <w:basedOn w:val="Heading2"/>
+    <w:link w:val="Heading2blueChar"/>
+    <w:qFormat/>
+    <w:rsid w:val="00F34D93"/>
+    <w:pPr>
+      <w:shd w:val="clear" w:color="auto" w:fill="C6DCE7"/>
+    </w:pPr>
+    <w:rPr>
+      <w:lang w:val="en-US"/>
+    </w:rPr>
+  </w:style>
+  <w:style w:type="character" w:customStyle="1" w:styleId="Heading2blueChar">
+    <w:name w:val="Heading 2_blue Char"/>
+    <w:basedOn w:val="DefaultParagraphFont"/>
+    <w:link w:val="Heading2blue"/>
+    <w:rsid w:val="00F34D93"/>
+    <w:rPr>
+      <w:rFonts w:ascii="Arial" w:eastAsiaTheme="majorEastAsia" w:hAnsi="Arial" w:cstheme="majorBidi"/>
+      <w:b/>
+      <w:bCs/>
+      <w:color w:val="404040" w:themeColor="text1" w:themeTint="BF"/>
+      <w:sz w:val="22"/>
+      <w:szCs w:val="22"/>
+      <w:shd w:val="clear" w:color="auto" w:fill="C6DCE7"/>
+    </w:rPr>
+  </w:style>
+  <w:style w:type="paragraph" w:customStyle="1" w:styleId="Heading2green">
+    <w:name w:val="Heading 2_green"/>
+    <w:basedOn w:val="Heading2blue"/>
+    <w:link w:val="Heading2greenChar"/>
+    <w:qFormat/>
+    <w:rsid w:val="00F34D93"/>
+    <w:pPr>
+      <w:shd w:val="clear" w:color="auto" w:fill="BAE7B6"/>
+    </w:pPr>
+  </w:style>
+  <w:style w:type="paragraph" w:customStyle="1" w:styleId="Heading2red">
+    <w:name w:val="Heading 2_red"/>
+    <w:basedOn w:val="Heading2green"/>
+    <w:link w:val="Heading2redChar"/>
+    <w:qFormat/>
+    <w:rsid w:val="00F34D93"/>
+    <w:pPr>
+      <w:shd w:val="clear" w:color="auto" w:fill="F5E2CC"/>
+    </w:pPr>
+  </w:style>
+  <w:style w:type="character" w:customStyle="1" w:styleId="Heading2greenChar">
+    <w:name w:val="Heading 2_green Char"/>
+    <w:basedOn w:val="Heading2blueChar"/>
+    <w:link w:val="Heading2green"/>
+    <w:rsid w:val="00F34D93"/>
+    <w:rPr>
+      <w:rFonts w:ascii="Arial" w:eastAsiaTheme="majorEastAsia" w:hAnsi="Arial" w:cstheme="majorBidi"/>
+      <w:b/>
+      <w:bCs/>
+      <w:color w:val="404040" w:themeColor="text1" w:themeTint="BF"/>
+      <w:sz w:val="22"/>
+      <w:szCs w:val="22"/>
+      <w:shd w:val="clear" w:color="auto" w:fill="BAE7B6"/>
+    </w:rPr>
+  </w:style>
+  <w:style w:type="character" w:customStyle="1" w:styleId="Heading2redChar">
+    <w:name w:val="Heading 2_red Char"/>
+    <w:basedOn w:val="Heading2greenChar"/>
+    <w:link w:val="Heading2red"/>
+    <w:rsid w:val="00F34D93"/>
+    <w:rPr>
+      <w:rFonts w:ascii="Arial" w:eastAsiaTheme="majorEastAsia" w:hAnsi="Arial" w:cstheme="majorBidi"/>
+      <w:b/>
+      <w:bCs/>
+      <w:color w:val="404040" w:themeColor="text1" w:themeTint="BF"/>
+      <w:sz w:val="22"/>
+      <w:szCs w:val="22"/>
+      <w:shd w:val="clear" w:color="auto" w:fill="F5E2CC"/>
+    </w:rPr>
+  </w:style>
+  <w:style w:type="paragraph" w:styleId="TOC1">
+    <w:name w:val="toc 1"/>
+    <w:basedOn w:val="Normal"/>
+    <w:next w:val="Normal"/>
+    <w:autoRedefine/>
+    <w:rsid w:val="000473E1"/>
+    <w:pPr>
+      <w:spacing w:before="360" w:after="0"/>
+    </w:pPr>
+    <w:rPr>
+      <w:rFonts w:asciiTheme="majorHAnsi" w:hAnsiTheme="majorHAnsi" w:cstheme="majorHAnsi"/>
+      <w:b/>
+      <w:bCs/>
+      <w:caps/>
+      <w:sz w:val="24"/>
+      <w:szCs w:val="24"/>
+    </w:rPr>
+  </w:style>
+  <w:style w:type="paragraph" w:styleId="TOC2">
+    <w:name w:val="toc 2"/>
+    <w:basedOn w:val="Normal"/>
+    <w:next w:val="Normal"/>
+    <w:autoRedefine/>
+    <w:rsid w:val="000473E1"/>
+    <w:pPr>
+      <w:spacing w:before="240" w:after="0"/>
+    </w:pPr>
+    <w:rPr>
+      <w:rFonts w:asciiTheme="minorHAnsi" w:hAnsiTheme="minorHAnsi"/>
+      <w:b/>
+      <w:bCs/>
+    </w:rPr>
+  </w:style>
+  <w:style w:type="paragraph" w:styleId="TOC3">
+    <w:name w:val="toc 3"/>
+    <w:basedOn w:val="Normal"/>
+    <w:next w:val="Normal"/>
+    <w:autoRedefine/>
+    <w:rsid w:val="000473E1"/>
+    <w:pPr>
+      <w:spacing w:after="0"/>
+      <w:ind w:left="200"/>
+    </w:pPr>
+    <w:rPr>
+      <w:rFonts w:asciiTheme="minorHAnsi" w:hAnsiTheme="minorHAnsi"/>
+    </w:rPr>
+  </w:style>
+  <w:style w:type="paragraph" w:styleId="TOC4">
+    <w:name w:val="toc 4"/>
+    <w:basedOn w:val="Normal"/>
+    <w:next w:val="Normal"/>
+    <w:autoRedefine/>
+    <w:rsid w:val="000473E1"/>
+    <w:pPr>
+      <w:spacing w:after="0"/>
+      <w:ind w:left="400"/>
+    </w:pPr>
+    <w:rPr>
+      <w:rFonts w:asciiTheme="minorHAnsi" w:hAnsiTheme="minorHAnsi"/>
+    </w:rPr>
+  </w:style>
+  <w:style w:type="paragraph" w:styleId="TOC5">
+    <w:name w:val="toc 5"/>
+    <w:basedOn w:val="Normal"/>
+    <w:next w:val="Normal"/>
+    <w:autoRedefine/>
+    <w:rsid w:val="000473E1"/>
+    <w:pPr>
+      <w:spacing w:after="0"/>
+      <w:ind w:left="600"/>
+    </w:pPr>
+    <w:rPr>
+      <w:rFonts w:asciiTheme="minorHAnsi" w:hAnsiTheme="minorHAnsi"/>
+    </w:rPr>
+  </w:style>
+  <w:style w:type="paragraph" w:styleId="TOC6">
+    <w:name w:val="toc 6"/>
+    <w:basedOn w:val="Normal"/>
+    <w:next w:val="Normal"/>
+    <w:autoRedefine/>
+    <w:rsid w:val="000473E1"/>
+    <w:pPr>
+      <w:spacing w:after="0"/>
+      <w:ind w:left="800"/>
+    </w:pPr>
+    <w:rPr>
+      <w:rFonts w:asciiTheme="minorHAnsi" w:hAnsiTheme="minorHAnsi"/>
+    </w:rPr>
+  </w:style>
+  <w:style w:type="paragraph" w:styleId="TOC7">
+    <w:name w:val="toc 7"/>
+    <w:basedOn w:val="Normal"/>
+    <w:next w:val="Normal"/>
+    <w:autoRedefine/>
+    <w:rsid w:val="000473E1"/>
+    <w:pPr>
+      <w:spacing w:after="0"/>
+      <w:ind w:left="1000"/>
+    </w:pPr>
+    <w:rPr>
+      <w:rFonts w:asciiTheme="minorHAnsi" w:hAnsiTheme="minorHAnsi"/>
+    </w:rPr>
+  </w:style>
+  <w:style w:type="paragraph" w:styleId="TOC8">
+    <w:name w:val="toc 8"/>
+    <w:basedOn w:val="Normal"/>
+    <w:next w:val="Normal"/>
+    <w:autoRedefine/>
+    <w:rsid w:val="000473E1"/>
+    <w:pPr>
+      <w:spacing w:after="0"/>
+      <w:ind w:left="1200"/>
+    </w:pPr>
+    <w:rPr>
+      <w:rFonts w:asciiTheme="minorHAnsi" w:hAnsiTheme="minorHAnsi"/>
+    </w:rPr>
+  </w:style>
+  <w:style w:type="paragraph" w:styleId="TOC9">
+    <w:name w:val="toc 9"/>
+    <w:basedOn w:val="Normal"/>
+    <w:next w:val="Normal"/>
+    <w:autoRedefine/>
+    <w:rsid w:val="000473E1"/>
+    <w:pPr>
+      <w:spacing w:after="0"/>
+      <w:ind w:left="1400"/>
+    </w:pPr>
+    <w:rPr>
+      <w:rFonts w:asciiTheme="minorHAnsi" w:hAnsiTheme="minorHAnsi"/>
     </w:rPr>
   </w:style>
 </w:styles>
@@ -2614,4 +3140,16 @@
   </a:objectDefaults>
   <a:extraClrSchemeLst/>
 </a:theme>
+</file>
+
+<file path=customXml/item1.xml><?xml version="1.0" encoding="utf-8"?>
+<b:Sources xmlns:b="http://schemas.openxmlformats.org/officeDocument/2006/bibliography" xmlns="http://schemas.openxmlformats.org/officeDocument/2006/bibliography" SelectedStyle="\APASixthEditionOfficeOnline.xsl" StyleName="APA" Version="6"/>
+</file>
+
+<file path=customXml/itemProps1.xml><?xml version="1.0" encoding="utf-8"?>
+<ds:datastoreItem xmlns:ds="http://schemas.openxmlformats.org/officeDocument/2006/customXml" ds:itemID="{AC7C5CA5-D1BF-43FC-96D8-1B1A843761F4}">
+  <ds:schemaRefs>
+    <ds:schemaRef ds:uri="http://schemas.openxmlformats.org/officeDocument/2006/bibliography"/>
+  </ds:schemaRefs>
+</ds:datastoreItem>
 </file>
</xml_diff>

<commit_message>
Added new indicators, revised categorisation charts
</commit_message>
<xml_diff>
--- a/Shiny_Merv_Markdown_Template.docx
+++ b/Shiny_Merv_Markdown_Template.docx
@@ -2,16 +2,7 @@
 <file path=word/document.xml><?xml version="1.0" encoding="utf-8"?>
 <w:document xmlns:wpc="http://schemas.microsoft.com/office/word/2010/wordprocessingCanvas" xmlns:cx="http://schemas.microsoft.com/office/drawing/2014/chartex" xmlns:cx1="http://schemas.microsoft.com/office/drawing/2015/9/8/chartex" xmlns:cx2="http://schemas.microsoft.com/office/drawing/2015/10/21/chartex" xmlns:cx3="http://schemas.microsoft.com/office/drawing/2016/5/9/chartex" xmlns:cx4="http://schemas.microsoft.com/office/drawing/2016/5/10/chartex" xmlns:cx5="http://schemas.microsoft.com/office/drawing/2016/5/11/chartex" xmlns:cx6="http://schemas.microsoft.com/office/drawing/2016/5/12/chartex" xmlns:cx7="http://schemas.microsoft.com/office/drawing/2016/5/13/chartex" xmlns:cx8="http://schemas.microsoft.com/office/drawing/2016/5/14/chartex" xmlns:mc="http://schemas.openxmlformats.org/markup-compatibility/2006" xmlns:aink="http://schemas.microsoft.com/office/drawing/2016/ink" xmlns:am3d="http://schemas.microsoft.com/office/drawing/2017/model3d" xmlns:o="urn:schemas-microsoft-com:office:office" xmlns:r="http://schemas.openxmlformats.org/officeDocument/2006/relationships" xmlns:m="http://schemas.openxmlformats.org/officeDocument/2006/math" xmlns:v="urn:schemas-microsoft-com:vml" xmlns:wp14="http://schemas.microsoft.com/office/word/2010/wordprocessingDrawing" xmlns:wp="http://schemas.openxmlformats.org/drawingml/2006/wordprocessingDrawing" xmlns:w10="urn:schemas-microsoft-com:office:word" xmlns:w="http://schemas.openxmlformats.org/wordprocessingml/2006/main" xmlns:w14="http://schemas.microsoft.com/office/word/2010/wordml" xmlns:w15="http://schemas.microsoft.com/office/word/2012/wordml" xmlns:w16cex="http://schemas.microsoft.com/office/word/2018/wordml/cex" xmlns:w16cid="http://schemas.microsoft.com/office/word/2016/wordml/cid" xmlns:w16="http://schemas.microsoft.com/office/word/2018/wordml" xmlns:w16sdtdh="http://schemas.microsoft.com/office/word/2020/wordml/sdtdatahash" xmlns:w16se="http://schemas.microsoft.com/office/word/2015/wordml/symex" xmlns:wpg="http://schemas.microsoft.com/office/word/2010/wordprocessingGroup" xmlns:wpi="http://schemas.microsoft.com/office/word/2010/wordprocessingInk" xmlns:wne="http://schemas.microsoft.com/office/word/2006/wordml" xmlns:wps="http://schemas.microsoft.com/office/word/2010/wordprocessingShape" mc:Ignorable="w14 w15 w16se w16cid w16 w16cex w16sdtdh wp14">
   <w:body>
-    <w:p>
-      <w:pPr>
-        <w:pStyle w:val="Compact"/>
-        <w:spacing w:before="0" w:after="0"/>
-        <w:contextualSpacing/>
-        <w:rPr>
-          <w:lang w:val="de-CH"/>
-        </w:rPr>
-      </w:pPr>
-    </w:p>
+    <w:p/>
     <w:sectPr>
       <w:footerReference w:type="default" r:id="rId8"/>
       <w:headerReference w:type="first" r:id="rId9"/>
@@ -30,6 +21,9 @@
 <w:endnotes xmlns:wpc="http://schemas.microsoft.com/office/word/2010/wordprocessingCanvas" xmlns:cx="http://schemas.microsoft.com/office/drawing/2014/chartex" xmlns:cx1="http://schemas.microsoft.com/office/drawing/2015/9/8/chartex" xmlns:cx2="http://schemas.microsoft.com/office/drawing/2015/10/21/chartex" xmlns:cx3="http://schemas.microsoft.com/office/drawing/2016/5/9/chartex" xmlns:cx4="http://schemas.microsoft.com/office/drawing/2016/5/10/chartex" xmlns:cx5="http://schemas.microsoft.com/office/drawing/2016/5/11/chartex" xmlns:cx6="http://schemas.microsoft.com/office/drawing/2016/5/12/chartex" xmlns:cx7="http://schemas.microsoft.com/office/drawing/2016/5/13/chartex" xmlns:cx8="http://schemas.microsoft.com/office/drawing/2016/5/14/chartex" xmlns:mc="http://schemas.openxmlformats.org/markup-compatibility/2006" xmlns:aink="http://schemas.microsoft.com/office/drawing/2016/ink" xmlns:am3d="http://schemas.microsoft.com/office/drawing/2017/model3d" xmlns:o="urn:schemas-microsoft-com:office:office" xmlns:r="http://schemas.openxmlformats.org/officeDocument/2006/relationships" xmlns:m="http://schemas.openxmlformats.org/officeDocument/2006/math" xmlns:v="urn:schemas-microsoft-com:vml" xmlns:wp14="http://schemas.microsoft.com/office/word/2010/wordprocessingDrawing" xmlns:wp="http://schemas.openxmlformats.org/drawingml/2006/wordprocessingDrawing" xmlns:w10="urn:schemas-microsoft-com:office:word" xmlns:w="http://schemas.openxmlformats.org/wordprocessingml/2006/main" xmlns:w14="http://schemas.microsoft.com/office/word/2010/wordml" xmlns:w15="http://schemas.microsoft.com/office/word/2012/wordml" xmlns:w16cex="http://schemas.microsoft.com/office/word/2018/wordml/cex" xmlns:w16cid="http://schemas.microsoft.com/office/word/2016/wordml/cid" xmlns:w16="http://schemas.microsoft.com/office/word/2018/wordml" xmlns:w16sdtdh="http://schemas.microsoft.com/office/word/2020/wordml/sdtdatahash" xmlns:w16se="http://schemas.microsoft.com/office/word/2015/wordml/symex" xmlns:wpg="http://schemas.microsoft.com/office/word/2010/wordprocessingGroup" xmlns:wpi="http://schemas.microsoft.com/office/word/2010/wordprocessingInk" xmlns:wne="http://schemas.microsoft.com/office/word/2006/wordml" xmlns:wps="http://schemas.microsoft.com/office/word/2010/wordprocessingShape" mc:Ignorable="w14 w15 w16se w16cid w16 w16cex w16sdtdh wp14">
   <w:endnote w:type="separator" w:id="-1">
     <w:p>
+      <w:pPr>
+        <w:spacing w:after="0"/>
+      </w:pPr>
       <w:r>
         <w:separator/>
       </w:r>
@@ -37,6 +31,9 @@
   </w:endnote>
   <w:endnote w:type="continuationSeparator" w:id="0">
     <w:p>
+      <w:pPr>
+        <w:spacing w:after="0"/>
+      </w:pPr>
       <w:r>
         <w:continuationSeparator/>
       </w:r>
@@ -155,6 +152,9 @@
 <w:footnotes xmlns:wpc="http://schemas.microsoft.com/office/word/2010/wordprocessingCanvas" xmlns:cx="http://schemas.microsoft.com/office/drawing/2014/chartex" xmlns:cx1="http://schemas.microsoft.com/office/drawing/2015/9/8/chartex" xmlns:cx2="http://schemas.microsoft.com/office/drawing/2015/10/21/chartex" xmlns:cx3="http://schemas.microsoft.com/office/drawing/2016/5/9/chartex" xmlns:cx4="http://schemas.microsoft.com/office/drawing/2016/5/10/chartex" xmlns:cx5="http://schemas.microsoft.com/office/drawing/2016/5/11/chartex" xmlns:cx6="http://schemas.microsoft.com/office/drawing/2016/5/12/chartex" xmlns:cx7="http://schemas.microsoft.com/office/drawing/2016/5/13/chartex" xmlns:cx8="http://schemas.microsoft.com/office/drawing/2016/5/14/chartex" xmlns:mc="http://schemas.openxmlformats.org/markup-compatibility/2006" xmlns:aink="http://schemas.microsoft.com/office/drawing/2016/ink" xmlns:am3d="http://schemas.microsoft.com/office/drawing/2017/model3d" xmlns:o="urn:schemas-microsoft-com:office:office" xmlns:r="http://schemas.openxmlformats.org/officeDocument/2006/relationships" xmlns:m="http://schemas.openxmlformats.org/officeDocument/2006/math" xmlns:v="urn:schemas-microsoft-com:vml" xmlns:wp14="http://schemas.microsoft.com/office/word/2010/wordprocessingDrawing" xmlns:wp="http://schemas.openxmlformats.org/drawingml/2006/wordprocessingDrawing" xmlns:w10="urn:schemas-microsoft-com:office:word" xmlns:w="http://schemas.openxmlformats.org/wordprocessingml/2006/main" xmlns:w14="http://schemas.microsoft.com/office/word/2010/wordml" xmlns:w15="http://schemas.microsoft.com/office/word/2012/wordml" xmlns:w16cex="http://schemas.microsoft.com/office/word/2018/wordml/cex" xmlns:w16cid="http://schemas.microsoft.com/office/word/2016/wordml/cid" xmlns:w16="http://schemas.microsoft.com/office/word/2018/wordml" xmlns:w16sdtdh="http://schemas.microsoft.com/office/word/2020/wordml/sdtdatahash" xmlns:w16se="http://schemas.microsoft.com/office/word/2015/wordml/symex" xmlns:wpg="http://schemas.microsoft.com/office/word/2010/wordprocessingGroup" xmlns:wpi="http://schemas.microsoft.com/office/word/2010/wordprocessingInk" xmlns:wne="http://schemas.microsoft.com/office/word/2006/wordml" xmlns:wps="http://schemas.microsoft.com/office/word/2010/wordprocessingShape" mc:Ignorable="w14 w15 w16se w16cid w16 w16cex w16sdtdh wp14">
   <w:footnote w:type="separator" w:id="-1">
     <w:p>
+      <w:pPr>
+        <w:spacing w:after="0"/>
+      </w:pPr>
       <w:r>
         <w:separator/>
       </w:r>
@@ -162,6 +162,9 @@
   </w:footnote>
   <w:footnote w:type="continuationSeparator" w:id="0">
     <w:p>
+      <w:pPr>
+        <w:spacing w:after="0"/>
+      </w:pPr>
       <w:r>
         <w:continuationSeparator/>
       </w:r>
@@ -188,7 +191,7 @@
         <w:szCs w:val="15"/>
       </w:rPr>
       <w:drawing>
-        <wp:anchor distT="0" distB="0" distL="114300" distR="114300" simplePos="0" relativeHeight="251658240" behindDoc="0" locked="0" layoutInCell="1" allowOverlap="1" wp14:anchorId="7067E790" wp14:editId="1E4F8760">
+        <wp:anchor distT="0" distB="0" distL="114300" distR="114300" simplePos="0" relativeHeight="251658240" behindDoc="0" locked="0" layoutInCell="1" allowOverlap="1" wp14:anchorId="76F3A3AE" wp14:editId="7BDB3521">
           <wp:simplePos x="0" y="0"/>
           <wp:positionH relativeFrom="column">
             <wp:posOffset>-384810</wp:posOffset>
@@ -199,7 +202,7 @@
           <wp:extent cx="1980000" cy="553928"/>
           <wp:effectExtent l="0" t="0" r="0" b="0"/>
           <wp:wrapNone/>
-          <wp:docPr id="5" name="Graphic 5"/>
+          <wp:docPr id="2" name="Graphic 2"/>
           <wp:cNvGraphicFramePr>
             <a:graphicFrameLocks xmlns:a="http://schemas.openxmlformats.org/drawingml/2006/main" noChangeAspect="1"/>
           </wp:cNvGraphicFramePr>
@@ -1512,7 +1515,7 @@
     <w:next w:val="BodyText"/>
     <w:uiPriority w:val="9"/>
     <w:qFormat/>
-    <w:rsid w:val="00987BBA"/>
+    <w:rsid w:val="004B6D47"/>
     <w:pPr>
       <w:keepNext/>
       <w:keepLines/>
@@ -2617,9 +2620,10 @@
     <w:basedOn w:val="Heading2"/>
     <w:link w:val="Heading2blueChar"/>
     <w:qFormat/>
-    <w:rsid w:val="00F34D93"/>
+    <w:rsid w:val="004E4566"/>
     <w:pPr>
       <w:shd w:val="clear" w:color="auto" w:fill="C6DCE7"/>
+      <w15:collapsed/>
     </w:pPr>
     <w:rPr>
       <w:lang w:val="en-US"/>
@@ -2629,7 +2633,7 @@
     <w:name w:val="Heading 2_blue Char"/>
     <w:basedOn w:val="DefaultParagraphFont"/>
     <w:link w:val="Heading2blue"/>
-    <w:rsid w:val="00F34D93"/>
+    <w:rsid w:val="004E4566"/>
     <w:rPr>
       <w:rFonts w:ascii="Arial" w:eastAsiaTheme="majorEastAsia" w:hAnsi="Arial" w:cstheme="majorBidi"/>
       <w:b/>
@@ -2819,6 +2823,29 @@
     </w:pPr>
     <w:rPr>
       <w:rFonts w:asciiTheme="minorHAnsi" w:hAnsiTheme="minorHAnsi"/>
+    </w:rPr>
+  </w:style>
+  <w:style w:type="paragraph" w:styleId="CommentText">
+    <w:name w:val="annotation text"/>
+    <w:basedOn w:val="Normal"/>
+    <w:link w:val="CommentTextChar"/>
+  </w:style>
+  <w:style w:type="character" w:customStyle="1" w:styleId="CommentTextChar">
+    <w:name w:val="Comment Text Char"/>
+    <w:basedOn w:val="DefaultParagraphFont"/>
+    <w:link w:val="CommentText"/>
+    <w:rPr>
+      <w:rFonts w:ascii="Arial" w:hAnsi="Arial" w:cs="Arial"/>
+      <w:sz w:val="20"/>
+      <w:szCs w:val="20"/>
+    </w:rPr>
+  </w:style>
+  <w:style w:type="character" w:styleId="CommentReference">
+    <w:name w:val="annotation reference"/>
+    <w:basedOn w:val="DefaultParagraphFont"/>
+    <w:rPr>
+      <w:sz w:val="16"/>
+      <w:szCs w:val="16"/>
     </w:rPr>
   </w:style>
 </w:styles>

</xml_diff>

<commit_message>
Updated the UI, small tweaks in docx
</commit_message>
<xml_diff>
--- a/Shiny_Merv_Markdown_Template.docx
+++ b/Shiny_Merv_Markdown_Template.docx
@@ -1515,11 +1515,11 @@
     <w:next w:val="BodyText"/>
     <w:uiPriority w:val="9"/>
     <w:qFormat/>
-    <w:rsid w:val="004B6D47"/>
+    <w:rsid w:val="00103C7D"/>
     <w:pPr>
       <w:keepNext/>
       <w:keepLines/>
-      <w:spacing w:before="120" w:after="0"/>
+      <w:spacing w:before="480" w:after="0"/>
       <w:outlineLvl w:val="0"/>
     </w:pPr>
     <w:rPr>
@@ -1539,7 +1539,7 @@
     <w:uiPriority w:val="9"/>
     <w:unhideWhenUsed/>
     <w:qFormat/>
-    <w:rsid w:val="0019790A"/>
+    <w:rsid w:val="00BB4435"/>
     <w:pPr>
       <w:keepNext/>
       <w:keepLines/>
@@ -1549,6 +1549,7 @@
       <w:shd w:val="clear" w:color="auto" w:fill="F2F2F2" w:themeFill="background1" w:themeFillShade="F2"/>
       <w:spacing w:before="200" w:after="0" w:line="480" w:lineRule="auto"/>
       <w:outlineLvl w:val="1"/>
+      <w15:collapsed/>
     </w:pPr>
     <w:rPr>
       <w:rFonts w:eastAsiaTheme="majorEastAsia" w:cstheme="majorBidi"/>
@@ -2623,7 +2624,6 @@
     <w:rsid w:val="004E4566"/>
     <w:pPr>
       <w:shd w:val="clear" w:color="auto" w:fill="C6DCE7"/>
-      <w15:collapsed/>
     </w:pPr>
     <w:rPr>
       <w:lang w:val="en-US"/>

</xml_diff>

<commit_message>
Split ui and server elements into separate modules. Added navpanels and multicountry analysis
</commit_message>
<xml_diff>
--- a/Shiny_Merv_Markdown_Template.docx
+++ b/Shiny_Merv_Markdown_Template.docx
@@ -2543,11 +2543,11 @@
     <w:basedOn w:val="NonBulletInstruction"/>
     <w:link w:val="CaptionNoteChar"/>
     <w:qFormat/>
-    <w:rsid w:val="00DC53CA"/>
+    <w:rsid w:val="00276F5A"/>
     <w:rPr>
       <w:i w:val="0"/>
       <w:iCs w:val="0"/>
-      <w:sz w:val="18"/>
+      <w:sz w:val="16"/>
       <w:szCs w:val="18"/>
     </w:rPr>
   </w:style>
@@ -2555,13 +2555,13 @@
     <w:name w:val="Caption_Note Char"/>
     <w:basedOn w:val="NonBulletInstructionChar"/>
     <w:link w:val="CaptionNote"/>
-    <w:rsid w:val="00DC53CA"/>
+    <w:rsid w:val="00276F5A"/>
     <w:rPr>
       <w:rFonts w:ascii="Arial" w:hAnsi="Arial" w:cs="Arial"/>
       <w:i w:val="0"/>
       <w:iCs w:val="0"/>
       <w:color w:val="808080" w:themeColor="background1" w:themeShade="80"/>
-      <w:sz w:val="18"/>
+      <w:sz w:val="16"/>
       <w:szCs w:val="18"/>
       <w:lang w:val="de-CH"/>
     </w:rPr>

</xml_diff>